<commit_message>
Resume: rename education heading to include certifications, add CI/CD, hyphenate end-to-end
Co-Authored-By: Claude Opus 5.5 <noreply@anthropic.com>
Claude-Session: https://claude.ai/code/session_01JEt4qwmVU1cFDGbxJF19gX
</commit_message>
<xml_diff>
--- a/resume/Abhishek_Nagargoje_Resume_Updated.docx
+++ b/resume/Abhishek_Nagargoje_Resume_Updated.docx
@@ -170,7 +170,27 @@
           <w:i w:val="0"/>
           <w:color w:val="1B1B1B"/>
         </w:rPr>
-        <w:t>Web Developer &amp; AI Agent Developer at Kargar Business Services, building and deploying production web applications end to end with React, TypeScript, Python/Django, Node.js, and PostgreSQL/Supabase. Experienced in payment gateway integration (ICICI Bank), admin dashboards, technical SEO, and LLM-powered AI agents and workflow automation.</w:t>
+        <w:t xml:space="preserve">Web Developer &amp; AI Agent Developer at Kargar Business Services, building and deploying production web applications </w:t>
+      </w:r>
+      <w:r>
+        <w:rPr>
+          <w:b w:val="0"/>
+          <w:i w:val="0"/>
+          <w:color w:val="1B1B1B"/>
+        </w:rPr>
+        <w:t>end</w:t>
+        <w:noBreakHyphen/>
+        <w:t>to</w:t>
+        <w:noBreakHyphen/>
+        <w:t>end</w:t>
+      </w:r>
+      <w:r>
+        <w:rPr>
+          <w:b w:val="0"/>
+          <w:i w:val="0"/>
+          <w:color w:val="1B1B1B"/>
+        </w:rPr>
+        <w:t xml:space="preserve"> with React, TypeScript, Python/Django, Node.js, and PostgreSQL/Supabase. Experienced in payment gateway integration (ICICI Bank), admin dashboards, technical SEO, and LLM-powered AI agents and workflow automation.</w:t>
       </w:r>
     </w:p>
     <w:p>
@@ -264,7 +284,7 @@
           <w:i w:val="0"/>
           <w:color w:val="1B1B1B"/>
         </w:rPr>
-        <w:t>Own end-to-end development of production web applications — React/TypeScript frontends, Supabase (PostgreSQL) schemas and APIs, admin dashboards, GitHub Actions CI, Vercel deployments, and production debugging.</w:t>
+        <w:t>Own end-to-end development of production web applications — React/TypeScript frontends, Supabase (PostgreSQL) schemas and APIs, admin dashboards, GitHub Actions CI/CD, Vercel deployments, and production debugging.</w:t>
       </w:r>
     </w:p>
     <w:p>
@@ -1037,7 +1057,7 @@
           <w:sz w:val="22"/>
           <w:spacing w:val="24"/>
         </w:rPr>
-        <w:t>EDUCATION &amp; ACHIEVEMENTS</w:t>
+        <w:t>EDUCATION, ACHIEVEMENTS &amp; CERTIFICATIONS</w:t>
       </w:r>
     </w:p>
     <w:p>

</xml_diff>